<commit_message>
Add workshop site and data files
Co-authored-by: Copilot <223556219+Copilot@users.noreply.github.com>
</commit_message>
<xml_diff>
--- a/files/03_ContosoMedical_VendorContract.docx
+++ b/files/03_ContosoMedical_VendorContract.docx
@@ -10,10 +10,25 @@
       <w:r>
         <w:rPr>
           <w:b/>
-          <w:color w:val="1E3A5F"/>
+          <w:color w:val="1E3A8A"/>
           <w:sz w:val="32"/>
         </w:rPr>
-        <w:t>VENDOR SERVICE AGREEMENT</w:t>
+        <w:t>MEDICAL EQUIPMENT MAINTENANCE &amp; SUPPORT SERVICES AGREEMENT</w:t>
+      </w:r>
+    </w:p>
+    <w:p/>
+    <w:p>
+      <w:pPr>
+        <w:jc w:val="center"/>
+      </w:pPr>
+      <w:r>
+        <w:rPr>
+          <w:b/>
+        </w:rPr>
+        <w:t xml:space="preserve">Contract Reference: </w:t>
+      </w:r>
+      <w:r>
+        <w:t>CMG-CONTRACT-2026-TMS-018</w:t>
       </w:r>
     </w:p>
     <w:p>
@@ -24,10 +39,359 @@
         <w:rPr>
           <w:b/>
         </w:rPr>
-        <w:t>Medical Linen &amp; Laundry Services</w:t>
+        <w:t xml:space="preserve">Client: </w:t>
+      </w:r>
+      <w:r>
+        <w:t>Contoso Medical Group Sdn Bhd (Company No. 123456-W)</w:t>
       </w:r>
     </w:p>
-    <w:p/>
+    <w:p>
+      <w:pPr>
+        <w:jc w:val="center"/>
+      </w:pPr>
+      <w:r>
+        <w:rPr>
+          <w:b/>
+        </w:rPr>
+        <w:t xml:space="preserve">Service Provider: </w:t>
+      </w:r>
+      <w:r>
+        <w:t>TechMed Services Sdn Bhd (Company No. 789012-X)</w:t>
+      </w:r>
+    </w:p>
+    <w:p>
+      <w:pPr>
+        <w:jc w:val="center"/>
+      </w:pPr>
+      <w:r>
+        <w:rPr>
+          <w:b/>
+        </w:rPr>
+        <w:t xml:space="preserve">Effective Date: </w:t>
+      </w:r>
+      <w:r>
+        <w:t>1 April 2026</w:t>
+      </w:r>
+    </w:p>
+    <w:p>
+      <w:pPr>
+        <w:jc w:val="center"/>
+      </w:pPr>
+      <w:r>
+        <w:rPr>
+          <w:b/>
+        </w:rPr>
+        <w:t xml:space="preserve">Annual Contract Value: </w:t>
+      </w:r>
+      <w:r>
+        <w:t>RM 1,850,000</w:t>
+      </w:r>
+    </w:p>
+    <w:p>
+      <w:r>
+        <w:br w:type="page"/>
+      </w:r>
+    </w:p>
+    <w:p>
+      <w:pPr>
+        <w:pStyle w:val="Heading1"/>
+      </w:pPr>
+      <w:r>
+        <w:rPr>
+          <w:color w:val="1E3A8A"/>
+        </w:rPr>
+        <w:t>1. RECITALS</w:t>
+      </w:r>
+    </w:p>
+    <w:p>
+      <w:r>
+        <w:rPr>
+          <w:b w:val="0"/>
+          <w:i w:val="0"/>
+        </w:rPr>
+        <w:t>A.  Contoso Medical Group Sdn Bhd ("Client") is a private healthcare group operating hospitals and specialist centres in Malaysia, requiring ongoing technical maintenance and support services for its medical equipment fleet.</w:t>
+      </w:r>
+    </w:p>
+    <w:p>
+      <w:r>
+        <w:rPr>
+          <w:b w:val="0"/>
+          <w:i w:val="0"/>
+        </w:rPr>
+        <w:t>B.  TechMed Services Sdn Bhd ("Service Provider") is a licensed provider of medical equipment maintenance, repair, and technical support services with demonstrable expertise in the categories of equipment operated by the Client.</w:t>
+      </w:r>
+    </w:p>
+    <w:p>
+      <w:r>
+        <w:rPr>
+          <w:b w:val="0"/>
+          <w:i w:val="0"/>
+        </w:rPr>
+        <w:t>C.  The parties wish to enter into this Agreement to set out the terms under which the Service Provider will provide the Services to the Client with effect from the Effective Date.</w:t>
+      </w:r>
+    </w:p>
+    <w:p>
+      <w:pPr>
+        <w:pStyle w:val="Heading1"/>
+      </w:pPr>
+      <w:r>
+        <w:rPr>
+          <w:color w:val="1E3A8A"/>
+        </w:rPr>
+        <w:t>2. DEFINITIONS</w:t>
+      </w:r>
+    </w:p>
+    <w:p>
+      <w:r>
+        <w:rPr>
+          <w:b w:val="0"/>
+          <w:i w:val="0"/>
+        </w:rPr>
+        <w:t>In this Agreement, unless the context otherwise requires:</w:t>
+      </w:r>
+    </w:p>
+    <w:p>
+      <w:pPr>
+        <w:pStyle w:val="ListBullet"/>
+      </w:pPr>
+      <w:r>
+        <w:rPr>
+          <w:b/>
+        </w:rPr>
+        <w:t xml:space="preserve">"Agreement" </w:t>
+      </w:r>
+      <w:r>
+        <w:t>means this Agreement including all Schedules.</w:t>
+      </w:r>
+    </w:p>
+    <w:p>
+      <w:pPr>
+        <w:pStyle w:val="ListBullet"/>
+      </w:pPr>
+      <w:r>
+        <w:rPr>
+          <w:b/>
+        </w:rPr>
+        <w:t xml:space="preserve">"Equipment" </w:t>
+      </w:r>
+      <w:r>
+        <w:t>means the medical devices listed in Schedule A.</w:t>
+      </w:r>
+    </w:p>
+    <w:p>
+      <w:pPr>
+        <w:pStyle w:val="ListBullet"/>
+      </w:pPr>
+      <w:r>
+        <w:rPr>
+          <w:b/>
+        </w:rPr>
+        <w:t xml:space="preserve">"Services" </w:t>
+      </w:r>
+      <w:r>
+        <w:t>means the maintenance, repair, monitoring, and helpdesk services in Clause 3.</w:t>
+      </w:r>
+    </w:p>
+    <w:p>
+      <w:pPr>
+        <w:pStyle w:val="ListBullet"/>
+      </w:pPr>
+      <w:r>
+        <w:rPr>
+          <w:b/>
+        </w:rPr>
+        <w:t xml:space="preserve">"SLA" </w:t>
+      </w:r>
+      <w:r>
+        <w:t>means the Service Level Agreement in Clause 4.</w:t>
+      </w:r>
+    </w:p>
+    <w:p>
+      <w:pPr>
+        <w:pStyle w:val="ListBullet"/>
+      </w:pPr>
+      <w:r>
+        <w:rPr>
+          <w:b/>
+        </w:rPr>
+        <w:t xml:space="preserve">"Response Time" </w:t>
+      </w:r>
+      <w:r>
+        <w:t>means elapsed time from Fault notification to technician engagement.</w:t>
+      </w:r>
+    </w:p>
+    <w:p>
+      <w:pPr>
+        <w:pStyle w:val="ListBullet"/>
+      </w:pPr>
+      <w:r>
+        <w:rPr>
+          <w:b/>
+        </w:rPr>
+        <w:t xml:space="preserve">"Uptime" </w:t>
+      </w:r>
+      <w:r>
+        <w:t>means percentage of scheduled operating hours Equipment is fully operational.</w:t>
+      </w:r>
+    </w:p>
+    <w:p>
+      <w:pPr>
+        <w:pStyle w:val="ListBullet"/>
+      </w:pPr>
+      <w:r>
+        <w:rPr>
+          <w:b/>
+        </w:rPr>
+        <w:t xml:space="preserve">"Critical Fault" </w:t>
+      </w:r>
+      <w:r>
+        <w:t>means a fault rendering Equipment wholly inoperable posing immediate risk to patient care.</w:t>
+      </w:r>
+    </w:p>
+    <w:p>
+      <w:pPr>
+        <w:pStyle w:val="ListBullet"/>
+      </w:pPr>
+      <w:r>
+        <w:rPr>
+          <w:b/>
+        </w:rPr>
+        <w:t xml:space="preserve">"Major Fault" </w:t>
+      </w:r>
+      <w:r>
+        <w:t>means a significant fault materially impairing Equipment performance.</w:t>
+      </w:r>
+    </w:p>
+    <w:p>
+      <w:pPr>
+        <w:pStyle w:val="ListBullet"/>
+      </w:pPr>
+      <w:r>
+        <w:rPr>
+          <w:b/>
+        </w:rPr>
+        <w:t xml:space="preserve">"Minor Fault" </w:t>
+      </w:r>
+      <w:r>
+        <w:t>means a fault causing partial limitation of functionality without immediate patient safety impact.</w:t>
+      </w:r>
+    </w:p>
+    <w:p>
+      <w:pPr>
+        <w:pStyle w:val="ListBullet"/>
+      </w:pPr>
+      <w:r>
+        <w:rPr>
+          <w:b/>
+        </w:rPr>
+        <w:t xml:space="preserve">"Contract Year" </w:t>
+      </w:r>
+      <w:r>
+        <w:t>means each twelve (12)-month period commencing on the Effective Date or any anniversary.</w:t>
+      </w:r>
+    </w:p>
+    <w:p>
+      <w:pPr>
+        <w:pStyle w:val="Heading1"/>
+      </w:pPr>
+      <w:r>
+        <w:rPr>
+          <w:color w:val="1E3A8A"/>
+        </w:rPr>
+        <w:t>3. SCOPE OF SERVICES</w:t>
+      </w:r>
+    </w:p>
+    <w:p>
+      <w:pPr>
+        <w:pStyle w:val="Heading2"/>
+      </w:pPr>
+      <w:r>
+        <w:rPr>
+          <w:color w:val="1D40AF"/>
+        </w:rPr>
+        <w:t>3.1  Planned Preventive Maintenance</w:t>
+      </w:r>
+    </w:p>
+    <w:p>
+      <w:r>
+        <w:rPr>
+          <w:b w:val="0"/>
+          <w:i w:val="0"/>
+        </w:rPr>
+        <w:t>The Service Provider shall conduct scheduled preventive maintenance quarterly on all Equipment in Schedule A. Not less than 48 hours advance notice shall be given prior to each visit. A maintenance log shall be provided within five (5) business days of completion.</w:t>
+      </w:r>
+    </w:p>
+    <w:p>
+      <w:pPr>
+        <w:pStyle w:val="Heading2"/>
+      </w:pPr>
+      <w:r>
+        <w:rPr>
+          <w:color w:val="1D40AF"/>
+        </w:rPr>
+        <w:t>3.2  Emergency Corrective Maintenance</w:t>
+      </w:r>
+    </w:p>
+    <w:p>
+      <w:r>
+        <w:rPr>
+          <w:b w:val="0"/>
+          <w:i w:val="0"/>
+        </w:rPr>
+        <w:t>The Service Provider shall provide emergency corrective maintenance 24 hours per day, 7 days per week. Response times and resolution times shall be as specified in Clause 4.</w:t>
+      </w:r>
+    </w:p>
+    <w:p>
+      <w:pPr>
+        <w:pStyle w:val="Heading2"/>
+      </w:pPr>
+      <w:r>
+        <w:rPr>
+          <w:color w:val="1D40AF"/>
+        </w:rPr>
+        <w:t>3.3  Consumables and Spare Parts</w:t>
+      </w:r>
+    </w:p>
+    <w:p>
+      <w:r>
+        <w:rPr>
+          <w:b w:val="0"/>
+          <w:i w:val="0"/>
+        </w:rPr>
+        <w:t>All spare parts shall be OEM parts or parts expressly approved in writing by the Client. All replacement parts carry a minimum 90-day warranty from installation. The Service Provider shall maintain adequate stock of high-turnover parts to meet response time requirements.</w:t>
+      </w:r>
+    </w:p>
+    <w:p>
+      <w:pPr>
+        <w:pStyle w:val="Heading2"/>
+      </w:pPr>
+      <w:r>
+        <w:rPr>
+          <w:color w:val="1D40AF"/>
+        </w:rPr>
+        <w:t>3.4  Remote Monitoring and Helpdesk</w:t>
+      </w:r>
+    </w:p>
+    <w:p>
+      <w:r>
+        <w:rPr>
+          <w:b w:val="0"/>
+          <w:i w:val="0"/>
+        </w:rPr>
+        <w:t>The Service Provider shall provide remote monitoring during business hours (Monday to Friday, 8:00 AM to 6:00 PM Malaysian Standard Time). An after-hours emergency hotline shall be maintained at all times for Critical Fault notifications.</w:t>
+      </w:r>
+    </w:p>
+    <w:p>
+      <w:pPr>
+        <w:pStyle w:val="Heading1"/>
+      </w:pPr>
+      <w:r>
+        <w:rPr>
+          <w:color w:val="1E3A8A"/>
+        </w:rPr>
+        <w:t>4. SERVICE LEVEL AGREEMENT</w:t>
+      </w:r>
+    </w:p>
     <w:tbl>
       <w:tblPr>
         <w:tblStyle w:val="TableGrid"/>
@@ -35,30 +399,85 @@
         <w:tblLook w:firstColumn="1" w:firstRow="1" w:lastColumn="0" w:lastRow="0" w:noHBand="0" w:noVBand="1" w:val="04A0"/>
       </w:tblPr>
       <w:tblGrid>
-        <w:gridCol w:w="4320"/>
-        <w:gridCol w:w="4320"/>
+        <w:gridCol w:w="1728"/>
+        <w:gridCol w:w="1728"/>
+        <w:gridCol w:w="1728"/>
+        <w:gridCol w:w="1728"/>
+        <w:gridCol w:w="1728"/>
       </w:tblGrid>
       <w:tr>
         <w:tc>
           <w:tcPr>
-            <w:tcW w:type="dxa" w:w="2880"/>
+            <w:tcW w:type="dxa" w:w="1728"/>
+            <w:shd w:fill="1E3A8A" w:color="auto" w:val="clear"/>
           </w:tcPr>
           <w:p>
             <w:r>
               <w:rPr>
                 <w:b/>
+                <w:color w:val="FFFFFF"/>
               </w:rPr>
-              <w:t>Agreement Reference:</w:t>
+              <w:t>Fault Type</w:t>
             </w:r>
           </w:p>
         </w:tc>
         <w:tc>
           <w:tcPr>
-            <w:tcW w:type="dxa" w:w="5760"/>
+            <w:tcW w:type="dxa" w:w="1728"/>
+            <w:shd w:fill="1E3A8A" w:color="auto" w:val="clear"/>
           </w:tcPr>
           <w:p>
             <w:r>
-              <w:t>CMC/CONT/2025/037</w:t>
+              <w:rPr>
+                <w:b/>
+                <w:color w:val="FFFFFF"/>
+              </w:rPr>
+              <w:t>Response Time</w:t>
+            </w:r>
+          </w:p>
+        </w:tc>
+        <w:tc>
+          <w:tcPr>
+            <w:tcW w:type="dxa" w:w="1728"/>
+            <w:shd w:fill="1E3A8A" w:color="auto" w:val="clear"/>
+          </w:tcPr>
+          <w:p>
+            <w:r>
+              <w:rPr>
+                <w:b/>
+                <w:color w:val="FFFFFF"/>
+              </w:rPr>
+              <w:t>Resolution Time</w:t>
+            </w:r>
+          </w:p>
+        </w:tc>
+        <w:tc>
+          <w:tcPr>
+            <w:tcW w:type="dxa" w:w="1728"/>
+            <w:shd w:fill="1E3A8A" w:color="auto" w:val="clear"/>
+          </w:tcPr>
+          <w:p>
+            <w:r>
+              <w:rPr>
+                <w:b/>
+                <w:color w:val="FFFFFF"/>
+              </w:rPr>
+              <w:t>Uptime Target</w:t>
+            </w:r>
+          </w:p>
+        </w:tc>
+        <w:tc>
+          <w:tcPr>
+            <w:tcW w:type="dxa" w:w="1728"/>
+            <w:shd w:fill="1E3A8A" w:color="auto" w:val="clear"/>
+          </w:tcPr>
+          <w:p>
+            <w:r>
+              <w:rPr>
+                <w:b/>
+                <w:color w:val="FFFFFF"/>
+              </w:rPr>
+              <w:t>Penalty</w:t>
             </w:r>
           </w:p>
         </w:tc>
@@ -66,24 +485,51 @@
       <w:tr>
         <w:tc>
           <w:tcPr>
-            <w:tcW w:type="dxa" w:w="2880"/>
+            <w:tcW w:type="dxa" w:w="1728"/>
           </w:tcPr>
           <w:p>
             <w:r>
-              <w:rPr>
-                <w:b/>
-              </w:rPr>
-              <w:t>Client:</w:t>
+              <w:t>Critical Fault</w:t>
             </w:r>
           </w:p>
         </w:tc>
         <w:tc>
           <w:tcPr>
-            <w:tcW w:type="dxa" w:w="5760"/>
+            <w:tcW w:type="dxa" w:w="1728"/>
           </w:tcPr>
           <w:p>
             <w:r>
-              <w:t>Contoso Medical Centre Sdn Bhd (Registration No. 198401012345 (123456-X))</w:t>
+              <w:t>4 hours</w:t>
+            </w:r>
+          </w:p>
+        </w:tc>
+        <w:tc>
+          <w:tcPr>
+            <w:tcW w:type="dxa" w:w="1728"/>
+          </w:tcPr>
+          <w:p>
+            <w:r>
+              <w:t>24 hours</w:t>
+            </w:r>
+          </w:p>
+        </w:tc>
+        <w:tc>
+          <w:tcPr>
+            <w:tcW w:type="dxa" w:w="1728"/>
+          </w:tcPr>
+          <w:p>
+            <w:r>
+              <w:t>99.5% per month</w:t>
+            </w:r>
+          </w:p>
+        </w:tc>
+        <w:tc>
+          <w:tcPr>
+            <w:tcW w:type="dxa" w:w="1728"/>
+          </w:tcPr>
+          <w:p>
+            <w:r>
+              <w:t>RM 5,000 per incident after 3 in any quarter</w:t>
             </w:r>
           </w:p>
         </w:tc>
@@ -91,24 +537,51 @@
       <w:tr>
         <w:tc>
           <w:tcPr>
-            <w:tcW w:type="dxa" w:w="2880"/>
+            <w:tcW w:type="dxa" w:w="1728"/>
           </w:tcPr>
           <w:p>
             <w:r>
-              <w:rPr>
-                <w:b/>
-              </w:rPr>
-              <w:t>Service Provider:</w:t>
+              <w:t>Major Fault</w:t>
             </w:r>
           </w:p>
         </w:tc>
         <w:tc>
           <w:tcPr>
-            <w:tcW w:type="dxa" w:w="5760"/>
+            <w:tcW w:type="dxa" w:w="1728"/>
           </w:tcPr>
           <w:p>
             <w:r>
-              <w:t>CleanMed Services Sdn Bhd (Registration No. 201001098765 (987654-K))</w:t>
+              <w:t>8 hours</w:t>
+            </w:r>
+          </w:p>
+        </w:tc>
+        <w:tc>
+          <w:tcPr>
+            <w:tcW w:type="dxa" w:w="1728"/>
+          </w:tcPr>
+          <w:p>
+            <w:r>
+              <w:t>72 hours</w:t>
+            </w:r>
+          </w:p>
+        </w:tc>
+        <w:tc>
+          <w:tcPr>
+            <w:tcW w:type="dxa" w:w="1728"/>
+          </w:tcPr>
+          <w:p>
+            <w:r>
+              <w:t>99.5% per month</w:t>
+            </w:r>
+          </w:p>
+        </w:tc>
+        <w:tc>
+          <w:tcPr>
+            <w:tcW w:type="dxa" w:w="1728"/>
+          </w:tcPr>
+          <w:p>
+            <w:r>
+              <w:t>RM 2,000 per incident after 5 in any quarter</w:t>
             </w:r>
           </w:p>
         </w:tc>
@@ -116,24 +589,547 @@
       <w:tr>
         <w:tc>
           <w:tcPr>
-            <w:tcW w:type="dxa" w:w="2880"/>
+            <w:tcW w:type="dxa" w:w="1728"/>
+          </w:tcPr>
+          <w:p>
+            <w:r>
+              <w:t>Minor Fault</w:t>
+            </w:r>
+          </w:p>
+        </w:tc>
+        <w:tc>
+          <w:tcPr>
+            <w:tcW w:type="dxa" w:w="1728"/>
+          </w:tcPr>
+          <w:p>
+            <w:r>
+              <w:t>24 hours</w:t>
+            </w:r>
+          </w:p>
+        </w:tc>
+        <w:tc>
+          <w:tcPr>
+            <w:tcW w:type="dxa" w:w="1728"/>
+          </w:tcPr>
+          <w:p>
+            <w:r>
+              <w:t>7 business days</w:t>
+            </w:r>
+          </w:p>
+        </w:tc>
+        <w:tc>
+          <w:tcPr>
+            <w:tcW w:type="dxa" w:w="1728"/>
+          </w:tcPr>
+          <w:p>
+            <w:r>
+              <w:t>99.5% per month</w:t>
+            </w:r>
+          </w:p>
+        </w:tc>
+        <w:tc>
+          <w:tcPr>
+            <w:tcW w:type="dxa" w:w="1728"/>
+          </w:tcPr>
+          <w:p>
+            <w:r>
+              <w:t>Escalation to Major Fault tier</w:t>
+            </w:r>
+          </w:p>
+        </w:tc>
+      </w:tr>
+    </w:tbl>
+    <w:p/>
+    <w:p>
+      <w:r>
+        <w:rPr>
+          <w:b w:val="0"/>
+          <w:i w:val="0"/>
+        </w:rPr>
+        <w:t>Monthly uptime reporting is mandatory. The Service Provider shall submit a signed uptime report to the Client's Head of Facilities by the fifth (5th) business day of each month.</w:t>
+      </w:r>
+    </w:p>
+    <w:p>
+      <w:pPr>
+        <w:pStyle w:val="Heading1"/>
+      </w:pPr>
+      <w:r>
+        <w:rPr>
+          <w:color w:val="1E3A8A"/>
+        </w:rPr>
+        <w:t>5. CONTRACT TERM AND RENEWAL</w:t>
+      </w:r>
+    </w:p>
+    <w:p>
+      <w:r>
+        <w:rPr>
+          <w:b w:val="0"/>
+          <w:i w:val="0"/>
+        </w:rPr>
+        <w:t>5.1  The initial term of this Agreement commences on 1 April 2026 and expires on 31 March 2029 ("Initial Term"), unless earlier terminated.</w:t>
+      </w:r>
+    </w:p>
+    <w:p>
+      <w:r>
+        <w:rPr>
+          <w:b w:val="0"/>
+          <w:i w:val="0"/>
+        </w:rPr>
+        <w:t>5.2  Following expiry of the Initial Term, this Agreement shall automatically renew for successive one (1)-year periods unless either party provides written notice of non-renewal not less than sixty (60) days prior to the expiry of the then-current term. Such notice shall be delivered by registered post or electronic mail with read receipt.</w:t>
+      </w:r>
+    </w:p>
+    <w:p>
+      <w:r>
+        <w:rPr>
+          <w:b w:val="0"/>
+          <w:i w:val="0"/>
+        </w:rPr>
+        <w:t>5.3  During any renewal period, all terms and conditions remain in full force and effect unless amended by written agreement.</w:t>
+      </w:r>
+    </w:p>
+    <w:p>
+      <w:pPr>
+        <w:pStyle w:val="Heading1"/>
+      </w:pPr>
+      <w:r>
+        <w:rPr>
+          <w:color w:val="1E3A8A"/>
+        </w:rPr>
+        <w:t>6. FEES AND PAYMENT</w:t>
+      </w:r>
+    </w:p>
+    <w:p>
+      <w:r>
+        <w:rPr>
+          <w:b w:val="0"/>
+          <w:i w:val="0"/>
+        </w:rPr>
+        <w:t>6.1  The Annual Base Fee is Ringgit Malaysia One Million Eight Hundred and Fifty Thousand (RM 1,850,000) per Contract Year, payable quarterly in advance in equal instalments of RM 462,500 per quarter, as set out in Schedule B.</w:t>
+      </w:r>
+    </w:p>
+    <w:p>
+      <w:r>
+        <w:rPr>
+          <w:b w:val="0"/>
+          <w:i w:val="0"/>
+        </w:rPr>
+        <w:t>6.2  Consumables and spare parts shall be billed separately on a monthly basis at the Service Provider's cost plus a handling margin of twelve percent (12%).</w:t>
+      </w:r>
+    </w:p>
+    <w:p>
+      <w:r>
+        <w:rPr>
+          <w:b w:val="0"/>
+          <w:i w:val="0"/>
+        </w:rPr>
+        <w:t>6.3  Payment is due within forty-five (45) days from the invoice date.</w:t>
+      </w:r>
+    </w:p>
+    <w:p>
+      <w:r>
+        <w:rPr>
+          <w:b w:val="0"/>
+          <w:i w:val="0"/>
+        </w:rPr>
+        <w:t>6.4  Amounts outstanding after the due date shall accrue interest at 1.5% per month from the due date until actual payment.</w:t>
+      </w:r>
+    </w:p>
+    <w:p>
+      <w:r>
+        <w:rPr>
+          <w:b w:val="0"/>
+          <w:i w:val="0"/>
+        </w:rPr>
+        <w:t>6.5  The Annual Base Fee shall not increase by more than five percent (5%) per annum commencing from the second Contract Year, subject to mutual agreement. Any proposed adjustment shall be notified in writing not less than ninety (90) days prior to the relevant Contract Year.</w:t>
+      </w:r>
+    </w:p>
+    <w:p>
+      <w:pPr>
+        <w:pStyle w:val="Heading1"/>
+      </w:pPr>
+      <w:r>
+        <w:rPr>
+          <w:color w:val="1E3A8A"/>
+        </w:rPr>
+        <w:t>7. INTELLECTUAL PROPERTY</w:t>
+      </w:r>
+    </w:p>
+    <w:p>
+      <w:r>
+        <w:rPr>
+          <w:b w:val="0"/>
+          <w:i w:val="0"/>
+        </w:rPr>
+        <w:t>7.1  The Service Provider retains all intellectual property rights in all software, diagnostic tools, monitoring systems, maintenance methodologies, and technical documentation used in providing the Services.</w:t>
+      </w:r>
+    </w:p>
+    <w:p>
+      <w:r>
+        <w:rPr>
+          <w:b w:val="0"/>
+          <w:i w:val="0"/>
+        </w:rPr>
+        <w:t>7.2  The Client is granted a non-exclusive, non-transferable licence to use the Service Provider's proprietary systems solely for receiving the Services during the Term. This licence terminates automatically on expiry or termination.</w:t>
+      </w:r>
+    </w:p>
+    <w:p>
+      <w:r>
+        <w:rPr>
+          <w:b w:val="0"/>
+          <w:i w:val="0"/>
+        </w:rPr>
+        <w:t>7.3  All service reports, maintenance records, diagnostic outputs, and performance data generated under this Agreement shall be and remain the sole property of the Service Provider. The Client shall have a limited right to access such data solely for its internal operational purposes during the Term.</w:t>
+      </w:r>
+    </w:p>
+    <w:p>
+      <w:pPr>
+        <w:pStyle w:val="Heading1"/>
+      </w:pPr>
+      <w:r>
+        <w:rPr>
+          <w:color w:val="1E3A8A"/>
+        </w:rPr>
+        <w:t>8. CONFIDENTIALITY</w:t>
+      </w:r>
+    </w:p>
+    <w:p>
+      <w:r>
+        <w:rPr>
+          <w:b w:val="0"/>
+          <w:i w:val="0"/>
+        </w:rPr>
+        <w:t>8.1  Each party shall keep confidential all Confidential Information received from the other and not disclose it to third parties without prior written consent. This obligation survives for five (5) years following expiry or termination.</w:t>
+      </w:r>
+    </w:p>
+    <w:p>
+      <w:r>
+        <w:rPr>
+          <w:b w:val="0"/>
+          <w:i w:val="0"/>
+        </w:rPr>
+        <w:t>8.2  Confidentiality does not apply to information that: (a) is publicly available without breach; (b) was already known to the receiving party; (c) is independently developed; or (d) is required by law or court order.</w:t>
+      </w:r>
+    </w:p>
+    <w:p>
+      <w:pPr>
+        <w:pStyle w:val="Heading1"/>
+      </w:pPr>
+      <w:r>
+        <w:rPr>
+          <w:color w:val="1E3A8A"/>
+        </w:rPr>
+        <w:t>9. LIMITATION OF LIABILITY</w:t>
+      </w:r>
+    </w:p>
+    <w:p>
+      <w:r>
+        <w:rPr>
+          <w:b w:val="0"/>
+          <w:i w:val="0"/>
+        </w:rPr>
+        <w:t>9.1  The aggregate liability of either party for any and all claims arising under or in connection with this Agreement shall not exceed the total fees paid or payable in the six (6) months immediately preceding the event giving rise to the claim.</w:t>
+      </w:r>
+    </w:p>
+    <w:p>
+      <w:r>
+        <w:rPr>
+          <w:b w:val="0"/>
+          <w:i w:val="0"/>
+        </w:rPr>
+        <w:t>9.2  Neither party shall be liable for indirect, consequential, special, incidental, or punitive loss or damage, including loss of profit, revenue, business, or data.</w:t>
+      </w:r>
+    </w:p>
+    <w:p>
+      <w:r>
+        <w:rPr>
+          <w:b w:val="0"/>
+          <w:i w:val="0"/>
+        </w:rPr>
+        <w:t>9.3  Nothing herein limits either party's liability for: (a) death or personal injury caused by negligence; (b) fraud; or (c) any liability that cannot be excluded under Malaysian law.</w:t>
+      </w:r>
+    </w:p>
+    <w:p>
+      <w:pPr>
+        <w:pStyle w:val="Heading1"/>
+      </w:pPr>
+      <w:r>
+        <w:rPr>
+          <w:color w:val="1E3A8A"/>
+        </w:rPr>
+        <w:t>10. INDEMNIFICATION</w:t>
+      </w:r>
+    </w:p>
+    <w:p>
+      <w:r>
+        <w:rPr>
+          <w:b w:val="0"/>
+          <w:i w:val="0"/>
+        </w:rPr>
+        <w:t>10.1  Each party shall indemnify and hold harmless the other party and its officers, directors, employees, and agents from any claims arising from the indemnifying party's own negligence or wilful misconduct.</w:t>
+      </w:r>
+    </w:p>
+    <w:p>
+      <w:pPr>
+        <w:pStyle w:val="Heading1"/>
+      </w:pPr>
+      <w:r>
+        <w:rPr>
+          <w:color w:val="1E3A8A"/>
+        </w:rPr>
+        <w:t>11. FORCE MAJEURE</w:t>
+      </w:r>
+    </w:p>
+    <w:p>
+      <w:r>
+        <w:rPr>
+          <w:b w:val="0"/>
+          <w:i w:val="0"/>
+        </w:rPr>
+        <w:t>11.1  Neither party shall be in breach of this Agreement for any failure or delay caused by a Force Majeure Event, meaning any event beyond reasonable control including: acts of God; war; terrorism; pandemic or epidemic; government action; strikes; supply chain disruption; critical component shortages; and cyber incidents affecting critical national infrastructure.</w:t>
+      </w:r>
+    </w:p>
+    <w:p>
+      <w:r>
+        <w:rPr>
+          <w:b w:val="0"/>
+          <w:i w:val="0"/>
+        </w:rPr>
+        <w:t>11.2  The affected party shall notify the other in writing within five (5) business days of the Force Majeure Event.</w:t>
+      </w:r>
+    </w:p>
+    <w:p>
+      <w:r>
+        <w:rPr>
+          <w:b w:val="0"/>
+          <w:i w:val="0"/>
+        </w:rPr>
+        <w:t>11.3  If a Force Majeure Event continues for more than sixty (60) consecutive days, either party may terminate on thirty (30) days written notice without liability.</w:t>
+      </w:r>
+    </w:p>
+    <w:p>
+      <w:pPr>
+        <w:pStyle w:val="Heading1"/>
+      </w:pPr>
+      <w:r>
+        <w:rPr>
+          <w:color w:val="1E3A8A"/>
+        </w:rPr>
+        <w:t>12. TERMINATION</w:t>
+      </w:r>
+    </w:p>
+    <w:p>
+      <w:r>
+        <w:rPr>
+          <w:b w:val="0"/>
+          <w:i w:val="0"/>
+        </w:rPr>
+        <w:t>12.1  For Cause: Either party may terminate with thirty (30) days notice to cure material breach; immediate termination if breach is not cured.</w:t>
+      </w:r>
+    </w:p>
+    <w:p>
+      <w:r>
+        <w:rPr>
+          <w:b w:val="0"/>
+          <w:i w:val="0"/>
+        </w:rPr>
+        <w:t>12.2  For Convenience: Either party may terminate by providing ninety (90) days written notice.</w:t>
+      </w:r>
+    </w:p>
+    <w:p>
+      <w:r>
+        <w:rPr>
+          <w:b w:val="0"/>
+          <w:i w:val="0"/>
+        </w:rPr>
+        <w:t>12.3  For Insolvency: Either party may terminate immediately if the other becomes insolvent or enters administration.</w:t>
+      </w:r>
+    </w:p>
+    <w:p>
+      <w:r>
+        <w:rPr>
+          <w:b w:val="0"/>
+          <w:i w:val="0"/>
+        </w:rPr>
+        <w:t>12.4  Transition: Upon termination or expiry, the Service Provider shall provide 60-day transition support at cost plus 10%.</w:t>
+      </w:r>
+    </w:p>
+    <w:p>
+      <w:pPr>
+        <w:pStyle w:val="Heading1"/>
+      </w:pPr>
+      <w:r>
+        <w:rPr>
+          <w:color w:val="1E3A8A"/>
+        </w:rPr>
+        <w:t>13. GOVERNING LAW AND DISPUTE RESOLUTION</w:t>
+      </w:r>
+    </w:p>
+    <w:p>
+      <w:r>
+        <w:rPr>
+          <w:b w:val="0"/>
+          <w:i w:val="0"/>
+        </w:rPr>
+        <w:t>13.1  This Agreement is governed by the laws of Malaysia.</w:t>
+      </w:r>
+    </w:p>
+    <w:p>
+      <w:r>
+        <w:rPr>
+          <w:b w:val="0"/>
+          <w:i w:val="0"/>
+        </w:rPr>
+        <w:t>13.2  Disputes shall be resolved by arbitration administered by the Asian International Arbitration Centre (AIAC), seat Kuala Lumpur, three arbitrators, conducted in English.</w:t>
+      </w:r>
+    </w:p>
+    <w:p>
+      <w:pPr>
+        <w:pStyle w:val="Heading1"/>
+      </w:pPr>
+      <w:r>
+        <w:rPr>
+          <w:color w:val="1E3A8A"/>
+        </w:rPr>
+        <w:t>14. GENERAL PROVISIONS</w:t>
+      </w:r>
+    </w:p>
+    <w:p>
+      <w:r>
+        <w:rPr>
+          <w:b w:val="0"/>
+          <w:i w:val="0"/>
+        </w:rPr>
+        <w:t>14.1  Entire Agreement: This Agreement constitutes the entire agreement and supersedes all prior understandings.</w:t>
+      </w:r>
+    </w:p>
+    <w:p>
+      <w:r>
+        <w:rPr>
+          <w:b w:val="0"/>
+          <w:i w:val="0"/>
+        </w:rPr>
+        <w:t>14.2  Amendments: No amendment is valid unless in writing signed by both parties.</w:t>
+      </w:r>
+    </w:p>
+    <w:p>
+      <w:r>
+        <w:rPr>
+          <w:b w:val="0"/>
+          <w:i w:val="0"/>
+        </w:rPr>
+        <w:t>14.3  Assignment: Neither party may assign without prior written consent of the other.</w:t>
+      </w:r>
+    </w:p>
+    <w:p>
+      <w:r>
+        <w:rPr>
+          <w:b w:val="0"/>
+          <w:i w:val="0"/>
+        </w:rPr>
+        <w:t>14.4  Severability: Invalid provisions do not affect remaining provisions.</w:t>
+      </w:r>
+    </w:p>
+    <w:p>
+      <w:r>
+        <w:rPr>
+          <w:b w:val="0"/>
+          <w:i w:val="0"/>
+        </w:rPr>
+        <w:t>14.5  Waiver: Failure to exercise a right does not constitute a waiver.</w:t>
+      </w:r>
+    </w:p>
+    <w:p>
+      <w:pPr>
+        <w:pStyle w:val="Heading1"/>
+      </w:pPr>
+      <w:r>
+        <w:rPr>
+          <w:color w:val="1E3A8A"/>
+        </w:rPr>
+        <w:t>15. SCHEDULES</w:t>
+      </w:r>
+    </w:p>
+    <w:p>
+      <w:pPr>
+        <w:pStyle w:val="Heading2"/>
+      </w:pPr>
+      <w:r>
+        <w:rPr>
+          <w:color w:val="1D40AF"/>
+        </w:rPr>
+        <w:t>Schedule A - Equipment List (Placeholder)</w:t>
+      </w:r>
+    </w:p>
+    <w:tbl>
+      <w:tblPr>
+        <w:tblStyle w:val="TableGrid"/>
+        <w:tblW w:type="auto" w:w="0"/>
+        <w:tblLook w:firstColumn="1" w:firstRow="1" w:lastColumn="0" w:lastRow="0" w:noHBand="0" w:noVBand="1" w:val="04A0"/>
+      </w:tblPr>
+      <w:tblGrid>
+        <w:gridCol w:w="2160"/>
+        <w:gridCol w:w="2160"/>
+        <w:gridCol w:w="2160"/>
+        <w:gridCol w:w="2160"/>
+      </w:tblGrid>
+      <w:tr>
+        <w:tc>
+          <w:tcPr>
+            <w:tcW w:type="dxa" w:w="2160"/>
+            <w:shd w:fill="2563EB" w:color="auto" w:val="clear"/>
           </w:tcPr>
           <w:p>
             <w:r>
               <w:rPr>
                 <w:b/>
+                <w:color w:val="FFFFFF"/>
               </w:rPr>
-              <w:t>Contract Value:</w:t>
+              <w:t>Equipment ID</w:t>
             </w:r>
           </w:p>
         </w:tc>
         <w:tc>
           <w:tcPr>
-            <w:tcW w:type="dxa" w:w="5760"/>
+            <w:tcW w:type="dxa" w:w="2160"/>
+            <w:shd w:fill="2563EB" w:color="auto" w:val="clear"/>
           </w:tcPr>
           <w:p>
             <w:r>
-              <w:t>RM 1,200,000 (Ringgit Malaysia One Million Two Hundred Thousand Only)</w:t>
+              <w:rPr>
+                <w:b/>
+                <w:color w:val="FFFFFF"/>
+              </w:rPr>
+              <w:t>Description</w:t>
+            </w:r>
+          </w:p>
+        </w:tc>
+        <w:tc>
+          <w:tcPr>
+            <w:tcW w:type="dxa" w:w="2160"/>
+            <w:shd w:fill="2563EB" w:color="auto" w:val="clear"/>
+          </w:tcPr>
+          <w:p>
+            <w:r>
+              <w:rPr>
+                <w:b/>
+                <w:color w:val="FFFFFF"/>
+              </w:rPr>
+              <w:t>Location</w:t>
+            </w:r>
+          </w:p>
+        </w:tc>
+        <w:tc>
+          <w:tcPr>
+            <w:tcW w:type="dxa" w:w="2160"/>
+            <w:shd w:fill="2563EB" w:color="auto" w:val="clear"/>
+          </w:tcPr>
+          <w:p>
+            <w:r>
+              <w:rPr>
+                <w:b/>
+                <w:color w:val="FFFFFF"/>
+              </w:rPr>
+              <w:t>Service Category</w:t>
             </w:r>
           </w:p>
         </w:tc>
@@ -141,24 +1137,203 @@
       <w:tr>
         <w:tc>
           <w:tcPr>
-            <w:tcW w:type="dxa" w:w="2880"/>
+            <w:tcW w:type="dxa" w:w="2160"/>
+          </w:tcPr>
+          <w:p/>
+        </w:tc>
+        <w:tc>
+          <w:tcPr>
+            <w:tcW w:type="dxa" w:w="2160"/>
+          </w:tcPr>
+          <w:p/>
+        </w:tc>
+        <w:tc>
+          <w:tcPr>
+            <w:tcW w:type="dxa" w:w="2160"/>
+          </w:tcPr>
+          <w:p/>
+        </w:tc>
+        <w:tc>
+          <w:tcPr>
+            <w:tcW w:type="dxa" w:w="2160"/>
+          </w:tcPr>
+          <w:p/>
+        </w:tc>
+      </w:tr>
+      <w:tr>
+        <w:tc>
+          <w:tcPr>
+            <w:tcW w:type="dxa" w:w="2160"/>
+          </w:tcPr>
+          <w:p/>
+        </w:tc>
+        <w:tc>
+          <w:tcPr>
+            <w:tcW w:type="dxa" w:w="2160"/>
+          </w:tcPr>
+          <w:p/>
+        </w:tc>
+        <w:tc>
+          <w:tcPr>
+            <w:tcW w:type="dxa" w:w="2160"/>
+          </w:tcPr>
+          <w:p/>
+        </w:tc>
+        <w:tc>
+          <w:tcPr>
+            <w:tcW w:type="dxa" w:w="2160"/>
+          </w:tcPr>
+          <w:p/>
+        </w:tc>
+      </w:tr>
+      <w:tr>
+        <w:tc>
+          <w:tcPr>
+            <w:tcW w:type="dxa" w:w="2160"/>
+          </w:tcPr>
+          <w:p/>
+        </w:tc>
+        <w:tc>
+          <w:tcPr>
+            <w:tcW w:type="dxa" w:w="2160"/>
+          </w:tcPr>
+          <w:p/>
+        </w:tc>
+        <w:tc>
+          <w:tcPr>
+            <w:tcW w:type="dxa" w:w="2160"/>
+          </w:tcPr>
+          <w:p/>
+        </w:tc>
+        <w:tc>
+          <w:tcPr>
+            <w:tcW w:type="dxa" w:w="2160"/>
+          </w:tcPr>
+          <w:p/>
+        </w:tc>
+      </w:tr>
+      <w:tr>
+        <w:tc>
+          <w:tcPr>
+            <w:tcW w:type="dxa" w:w="2160"/>
           </w:tcPr>
           <w:p>
             <w:r>
-              <w:rPr>
-                <w:b/>
-              </w:rPr>
-              <w:t>Contract Period:</w:t>
+              <w:t>EQ-001</w:t>
             </w:r>
           </w:p>
         </w:tc>
         <w:tc>
           <w:tcPr>
-            <w:tcW w:type="dxa" w:w="5760"/>
+            <w:tcW w:type="dxa" w:w="2160"/>
           </w:tcPr>
           <w:p>
             <w:r>
-              <w:t>1 June 2025 to 31 May 2027 (24 months)</w:t>
+              <w:t>MRI Scanner 3T</w:t>
+            </w:r>
+          </w:p>
+        </w:tc>
+        <w:tc>
+          <w:tcPr>
+            <w:tcW w:type="dxa" w:w="2160"/>
+          </w:tcPr>
+          <w:p>
+            <w:r>
+              <w:t>Radiology Dept</w:t>
+            </w:r>
+          </w:p>
+        </w:tc>
+        <w:tc>
+          <w:tcPr>
+            <w:tcW w:type="dxa" w:w="2160"/>
+          </w:tcPr>
+          <w:p>
+            <w:r>
+              <w:t>Critical</w:t>
+            </w:r>
+          </w:p>
+        </w:tc>
+      </w:tr>
+      <w:tr>
+        <w:tc>
+          <w:tcPr>
+            <w:tcW w:type="dxa" w:w="2160"/>
+          </w:tcPr>
+          <w:p>
+            <w:r>
+              <w:t>EQ-002</w:t>
+            </w:r>
+          </w:p>
+        </w:tc>
+        <w:tc>
+          <w:tcPr>
+            <w:tcW w:type="dxa" w:w="2160"/>
+          </w:tcPr>
+          <w:p>
+            <w:r>
+              <w:t>CT Scanner 128-slice</w:t>
+            </w:r>
+          </w:p>
+        </w:tc>
+        <w:tc>
+          <w:tcPr>
+            <w:tcW w:type="dxa" w:w="2160"/>
+          </w:tcPr>
+          <w:p>
+            <w:r>
+              <w:t>Radiology Dept</w:t>
+            </w:r>
+          </w:p>
+        </w:tc>
+        <w:tc>
+          <w:tcPr>
+            <w:tcW w:type="dxa" w:w="2160"/>
+          </w:tcPr>
+          <w:p>
+            <w:r>
+              <w:t>Critical</w:t>
+            </w:r>
+          </w:p>
+        </w:tc>
+      </w:tr>
+      <w:tr>
+        <w:tc>
+          <w:tcPr>
+            <w:tcW w:type="dxa" w:w="2160"/>
+          </w:tcPr>
+          <w:p>
+            <w:r>
+              <w:t>EQ-003</w:t>
+            </w:r>
+          </w:p>
+        </w:tc>
+        <w:tc>
+          <w:tcPr>
+            <w:tcW w:type="dxa" w:w="2160"/>
+          </w:tcPr>
+          <w:p>
+            <w:r>
+              <w:t>ICU Monitoring Systems (x12)</w:t>
+            </w:r>
+          </w:p>
+        </w:tc>
+        <w:tc>
+          <w:tcPr>
+            <w:tcW w:type="dxa" w:w="2160"/>
+          </w:tcPr>
+          <w:p>
+            <w:r>
+              <w:t>ICU Ward</w:t>
+            </w:r>
+          </w:p>
+        </w:tc>
+        <w:tc>
+          <w:tcPr>
+            <w:tcW w:type="dxa" w:w="2160"/>
+          </w:tcPr>
+          <w:p>
+            <w:r>
+              <w:t>Critical</w:t>
             </w:r>
           </w:p>
         </w:tc>
@@ -171,136 +1346,9 @@
       </w:pPr>
       <w:r>
         <w:rPr>
-          <w:color w:val="1E3A5F"/>
+          <w:color w:val="1D40AF"/>
         </w:rPr>
-        <w:t>1. PARTIES</w:t>
-      </w:r>
-    </w:p>
-    <w:p>
-      <w:r>
-        <w:rPr>
-          <w:b w:val="0"/>
-          <w:i w:val="0"/>
-          <w:sz w:val="22"/>
-        </w:rPr>
-        <w:t>1.1  "Client" refers to Contoso Medical Centre Sdn Bhd, a private tertiary hospital licensed under the Private Healthcare Facilities and Services Act 1998, with its principal address at Lot 5, Jalan Hospital, 47500 Subang Jaya, Selangor, Malaysia.</w:t>
-      </w:r>
-    </w:p>
-    <w:p>
-      <w:r>
-        <w:rPr>
-          <w:b w:val="0"/>
-          <w:i w:val="0"/>
-          <w:sz w:val="22"/>
-        </w:rPr>
-        <w:t>1.2  "Service Provider" refers to CleanMed Services Sdn Bhd, a company duly incorporated in Malaysia and licensed to provide commercial laundry and linen management services, with its principal address at Lot 22, Jalan Industri 3, Kawasan Perindustrian Temasya, 40150 Shah Alam, Selangor.</w:t>
-      </w:r>
-    </w:p>
-    <w:p>
-      <w:pPr>
-        <w:pStyle w:val="Heading2"/>
-      </w:pPr>
-      <w:r>
-        <w:rPr>
-          <w:color w:val="1E3A5F"/>
-        </w:rPr>
-        <w:t>2. SCOPE OF SERVICES</w:t>
-      </w:r>
-    </w:p>
-    <w:p>
-      <w:r>
-        <w:rPr>
-          <w:b w:val="0"/>
-          <w:i w:val="0"/>
-          <w:sz w:val="22"/>
-        </w:rPr>
-        <w:t>2.1  The Service Provider shall provide the following linen and laundry management services to the Client:</w:t>
-      </w:r>
-    </w:p>
-    <w:p>
-      <w:pPr>
-        <w:ind w:left="432"/>
-      </w:pPr>
-      <w:r>
-        <w:rPr>
-          <w:b w:val="0"/>
-          <w:i w:val="0"/>
-          <w:sz w:val="22"/>
-        </w:rPr>
-        <w:t xml:space="preserve">   •  Daily collection of soiled linen from all wards, operating theatres, and clinical areas (collection schedule: 6:00 AM and 2:00 PM daily, including public holidays)</w:t>
-      </w:r>
-    </w:p>
-    <w:p>
-      <w:pPr>
-        <w:ind w:left="432"/>
-      </w:pPr>
-      <w:r>
-        <w:rPr>
-          <w:b w:val="0"/>
-          <w:i w:val="0"/>
-          <w:sz w:val="22"/>
-        </w:rPr>
-        <w:t xml:space="preserve">   •  Commercial laundering, disinfection, ironing, and folding of all collected linen in accordance with MS ISO 15748 and hospital infection control standards</w:t>
-      </w:r>
-    </w:p>
-    <w:p>
-      <w:pPr>
-        <w:ind w:left="432"/>
-      </w:pPr>
-      <w:r>
-        <w:rPr>
-          <w:b w:val="0"/>
-          <w:i w:val="0"/>
-          <w:sz w:val="22"/>
-        </w:rPr>
-        <w:t xml:space="preserve">   •  Return of clean, packaged linen within 24 hours of collection. Emergency processing (8-hour turnaround) available upon request at no additional charge</w:t>
-      </w:r>
-    </w:p>
-    <w:p>
-      <w:pPr>
-        <w:ind w:left="432"/>
-      </w:pPr>
-      <w:r>
-        <w:rPr>
-          <w:b w:val="0"/>
-          <w:i w:val="0"/>
-          <w:sz w:val="22"/>
-        </w:rPr>
-        <w:t xml:space="preserve">   •  Monthly inventory reporting, linen condition assessment, and replacement recommendations</w:t>
-      </w:r>
-    </w:p>
-    <w:p>
-      <w:pPr>
-        <w:ind w:left="432"/>
-      </w:pPr>
-      <w:r>
-        <w:rPr>
-          <w:b w:val="0"/>
-          <w:i w:val="0"/>
-          <w:sz w:val="22"/>
-        </w:rPr>
-        <w:t xml:space="preserve">   •  Provision of a dedicated account manager and 24/7 emergency helpline</w:t>
-      </w:r>
-    </w:p>
-    <w:p>
-      <w:pPr>
-        <w:pStyle w:val="Heading2"/>
-      </w:pPr>
-      <w:r>
-        <w:rPr>
-          <w:color w:val="1E3A5F"/>
-        </w:rPr>
-        <w:t>3. SERVICE LEVELS AND KEY PERFORMANCE INDICATORS</w:t>
-      </w:r>
-    </w:p>
-    <w:p>
-      <w:r>
-        <w:rPr>
-          <w:b w:val="0"/>
-          <w:i w:val="0"/>
-          <w:sz w:val="22"/>
-        </w:rPr>
-        <w:t>3.1  The Service Provider shall maintain the following minimum service level standards throughout the contract period:</w:t>
+        <w:t>Schedule B - Fee Schedule</w:t>
       </w:r>
     </w:p>
     <w:tbl>
@@ -318,13 +1366,137 @@
         <w:tc>
           <w:tcPr>
             <w:tcW w:type="dxa" w:w="2880"/>
+            <w:shd w:fill="2563EB" w:color="auto" w:val="clear"/>
           </w:tcPr>
           <w:p>
             <w:r>
               <w:rPr>
                 <w:b/>
+                <w:color w:val="FFFFFF"/>
               </w:rPr>
-              <w:t>KPI</w:t>
+              <w:t>Payment</w:t>
+            </w:r>
+          </w:p>
+        </w:tc>
+        <w:tc>
+          <w:tcPr>
+            <w:tcW w:type="dxa" w:w="2880"/>
+            <w:shd w:fill="2563EB" w:color="auto" w:val="clear"/>
+          </w:tcPr>
+          <w:p>
+            <w:r>
+              <w:rPr>
+                <w:b/>
+                <w:color w:val="FFFFFF"/>
+              </w:rPr>
+              <w:t>Due Date</w:t>
+            </w:r>
+          </w:p>
+        </w:tc>
+        <w:tc>
+          <w:tcPr>
+            <w:tcW w:type="dxa" w:w="2880"/>
+            <w:shd w:fill="2563EB" w:color="auto" w:val="clear"/>
+          </w:tcPr>
+          <w:p>
+            <w:r>
+              <w:rPr>
+                <w:b/>
+                <w:color w:val="FFFFFF"/>
+              </w:rPr>
+              <w:t>Amount (RM)</w:t>
+            </w:r>
+          </w:p>
+        </w:tc>
+      </w:tr>
+      <w:tr>
+        <w:tc>
+          <w:tcPr>
+            <w:tcW w:type="dxa" w:w="2880"/>
+          </w:tcPr>
+          <w:p/>
+        </w:tc>
+        <w:tc>
+          <w:tcPr>
+            <w:tcW w:type="dxa" w:w="2880"/>
+          </w:tcPr>
+          <w:p/>
+        </w:tc>
+        <w:tc>
+          <w:tcPr>
+            <w:tcW w:type="dxa" w:w="2880"/>
+          </w:tcPr>
+          <w:p/>
+        </w:tc>
+      </w:tr>
+      <w:tr>
+        <w:tc>
+          <w:tcPr>
+            <w:tcW w:type="dxa" w:w="2880"/>
+          </w:tcPr>
+          <w:p/>
+        </w:tc>
+        <w:tc>
+          <w:tcPr>
+            <w:tcW w:type="dxa" w:w="2880"/>
+          </w:tcPr>
+          <w:p/>
+        </w:tc>
+        <w:tc>
+          <w:tcPr>
+            <w:tcW w:type="dxa" w:w="2880"/>
+          </w:tcPr>
+          <w:p/>
+        </w:tc>
+      </w:tr>
+      <w:tr>
+        <w:tc>
+          <w:tcPr>
+            <w:tcW w:type="dxa" w:w="2880"/>
+          </w:tcPr>
+          <w:p/>
+        </w:tc>
+        <w:tc>
+          <w:tcPr>
+            <w:tcW w:type="dxa" w:w="2880"/>
+          </w:tcPr>
+          <w:p/>
+        </w:tc>
+        <w:tc>
+          <w:tcPr>
+            <w:tcW w:type="dxa" w:w="2880"/>
+          </w:tcPr>
+          <w:p/>
+        </w:tc>
+      </w:tr>
+      <w:tr>
+        <w:tc>
+          <w:tcPr>
+            <w:tcW w:type="dxa" w:w="2880"/>
+          </w:tcPr>
+          <w:p/>
+        </w:tc>
+        <w:tc>
+          <w:tcPr>
+            <w:tcW w:type="dxa" w:w="2880"/>
+          </w:tcPr>
+          <w:p/>
+        </w:tc>
+        <w:tc>
+          <w:tcPr>
+            <w:tcW w:type="dxa" w:w="2880"/>
+          </w:tcPr>
+          <w:p/>
+        </w:tc>
+      </w:tr>
+      <w:tr>
+        <w:tc>
+          <w:tcPr>
+            <w:tcW w:type="dxa" w:w="2880"/>
+          </w:tcPr>
+          <w:p>
+            <w:r>
+              <w:t>Q1 2026</w:t>
             </w:r>
           </w:p>
         </w:tc>
@@ -334,10 +1506,7 @@
           </w:tcPr>
           <w:p>
             <w:r>
-              <w:rPr>
-                <w:b/>
-              </w:rPr>
-              <w:t>Target</w:t>
+              <w:t>1 April 2026</w:t>
             </w:r>
           </w:p>
         </w:tc>
@@ -347,10 +1516,7 @@
           </w:tcPr>
           <w:p>
             <w:r>
-              <w:rPr>
-                <w:b/>
-              </w:rPr>
-              <w:t>Penalty for Breach</w:t>
+              <w:t>462,500</w:t>
             </w:r>
           </w:p>
         </w:tc>
@@ -362,7 +1528,7 @@
           </w:tcPr>
           <w:p>
             <w:r>
-              <w:t>On-Time Delivery Rate</w:t>
+              <w:t>Q2 2026</w:t>
             </w:r>
           </w:p>
         </w:tc>
@@ -372,7 +1538,7 @@
           </w:tcPr>
           <w:p>
             <w:r>
-              <w:t>≥ 99.5% per month</w:t>
+              <w:t>1 July 2026</w:t>
             </w:r>
           </w:p>
         </w:tc>
@@ -382,7 +1548,7 @@
           </w:tcPr>
           <w:p>
             <w:r>
-              <w:t>RM 500 per incident below 98%</w:t>
+              <w:t>462,500</w:t>
             </w:r>
           </w:p>
         </w:tc>
@@ -394,7 +1560,7 @@
           </w:tcPr>
           <w:p>
             <w:r>
-              <w:t>Quality Rejection Rate</w:t>
+              <w:t>Q3 2026</w:t>
             </w:r>
           </w:p>
         </w:tc>
@@ -404,7 +1570,7 @@
           </w:tcPr>
           <w:p>
             <w:r>
-              <w:t>≤ 0.5% of items returned</w:t>
+              <w:t>1 October 2026</w:t>
             </w:r>
           </w:p>
         </w:tc>
@@ -414,7 +1580,7 @@
           </w:tcPr>
           <w:p>
             <w:r>
-              <w:t>RM 200 per percentage point above 1%</w:t>
+              <w:t>462,500</w:t>
             </w:r>
           </w:p>
         </w:tc>
@@ -426,7 +1592,7 @@
           </w:tcPr>
           <w:p>
             <w:r>
-              <w:t>Infection Compliance Rate</w:t>
+              <w:t>Q4 2026</w:t>
             </w:r>
           </w:p>
         </w:tc>
@@ -436,7 +1602,7 @@
           </w:tcPr>
           <w:p>
             <w:r>
-              <w:t>100% (zero non-conformances)</w:t>
+              <w:t>1 January 2027</w:t>
             </w:r>
           </w:p>
         </w:tc>
@@ -446,71 +1612,7 @@
           </w:tcPr>
           <w:p>
             <w:r>
-              <w:t>Immediate escalation + RM 2,000 per incident</w:t>
-            </w:r>
-          </w:p>
-        </w:tc>
-      </w:tr>
-      <w:tr>
-        <w:tc>
-          <w:tcPr>
-            <w:tcW w:type="dxa" w:w="2880"/>
-          </w:tcPr>
-          <w:p>
-            <w:r>
-              <w:t>Emergency Turnaround</w:t>
-            </w:r>
-          </w:p>
-        </w:tc>
-        <w:tc>
-          <w:tcPr>
-            <w:tcW w:type="dxa" w:w="2880"/>
-          </w:tcPr>
-          <w:p>
-            <w:r>
-              <w:t>≤ 8 hours</w:t>
-            </w:r>
-          </w:p>
-        </w:tc>
-        <w:tc>
-          <w:tcPr>
-            <w:tcW w:type="dxa" w:w="2880"/>
-          </w:tcPr>
-          <w:p>
-            <w:r>
-              <w:t>RM 300 per missed emergency request</w:t>
-            </w:r>
-          </w:p>
-        </w:tc>
-      </w:tr>
-      <w:tr>
-        <w:tc>
-          <w:tcPr>
-            <w:tcW w:type="dxa" w:w="2880"/>
-          </w:tcPr>
-          <w:p>
-            <w:r>
-              <w:t>Account Manager Response</w:t>
-            </w:r>
-          </w:p>
-        </w:tc>
-        <w:tc>
-          <w:tcPr>
-            <w:tcW w:type="dxa" w:w="2880"/>
-          </w:tcPr>
-          <w:p>
-            <w:r>
-              <w:t>Within 2 business hours</w:t>
-            </w:r>
-          </w:p>
-        </w:tc>
-        <w:tc>
-          <w:tcPr>
-            <w:tcW w:type="dxa" w:w="2880"/>
-          </w:tcPr>
-          <w:p>
-            <w:r>
-              <w:t>Formal notice after 3 consecutive breaches</w:t>
+              <w:t>462,500</w:t>
             </w:r>
           </w:p>
         </w:tc>
@@ -519,13 +1621,13 @@
     <w:p/>
     <w:p>
       <w:pPr>
-        <w:pStyle w:val="Heading2"/>
+        <w:pStyle w:val="Heading1"/>
       </w:pPr>
       <w:r>
         <w:rPr>
-          <w:color w:val="1E3A5F"/>
+          <w:color w:val="1E3A8A"/>
         </w:rPr>
-        <w:t>4. PAYMENT TERMS</w:t>
+        <w:t>16. EXECUTION</w:t>
       </w:r>
     </w:p>
     <w:p>
@@ -533,262 +1635,14 @@
         <w:rPr>
           <w:b w:val="0"/>
           <w:i w:val="0"/>
-          <w:sz w:val="22"/>
         </w:rPr>
-        <w:t>4.1  The Client shall pay the Service Provider a monthly fee of RM 50,000 (Ringgit Malaysia Fifty Thousand Only) per month.</w:t>
-      </w:r>
-    </w:p>
-    <w:p>
-      <w:r>
-        <w:rPr>
-          <w:b w:val="0"/>
-          <w:i w:val="0"/>
-          <w:sz w:val="22"/>
-        </w:rPr>
-        <w:t>4.2  Invoices shall be issued by the Service Provider on the first business day of each calendar month for services rendered in the preceding month.</w:t>
-      </w:r>
-    </w:p>
-    <w:p>
-      <w:r>
-        <w:rPr>
-          <w:b/>
-          <w:i w:val="0"/>
-          <w:sz w:val="22"/>
-        </w:rPr>
-        <w:t>⚠️  4.3  Payment shall be made within forty-five (45) calendar days from the date of invoice (Net-45 terms). [NOTE: Industry standard for hospital-vendor agreements is Net-30. This clause is unfavourable to the Client.]</w:t>
-      </w:r>
-    </w:p>
-    <w:p>
-      <w:r>
-        <w:rPr>
-          <w:b w:val="0"/>
-          <w:i w:val="0"/>
-          <w:sz w:val="22"/>
-        </w:rPr>
-        <w:t>4.4  Late payment interest shall be charged at 1.5% per month on any outstanding balance after the due date.</w:t>
-      </w:r>
-    </w:p>
-    <w:p>
-      <w:pPr>
-        <w:pStyle w:val="Heading2"/>
-      </w:pPr>
-      <w:r>
-        <w:rPr>
-          <w:color w:val="1E3A5F"/>
-        </w:rPr>
-        <w:t>5. PRICE ESCALATION</w:t>
-      </w:r>
-    </w:p>
-    <w:p>
-      <w:r>
-        <w:rPr>
-          <w:b/>
-          <w:i w:val="0"/>
-          <w:sz w:val="22"/>
-        </w:rPr>
-        <w:t>⚠️  5.1  The monthly service fee of RM 50,000 shall be subject to an automatic annual price increase of eight percent (8%) on each anniversary of the Commencement Date, without the requirement for prior notice or negotiation.</w:t>
-      </w:r>
-    </w:p>
-    <w:p>
-      <w:r>
-        <w:rPr>
-          <w:b/>
-          <w:i w:val="0"/>
-          <w:sz w:val="22"/>
-        </w:rPr>
-        <w:t>⚠️  5.2  The 8% annual escalation shall apply regardless of prevailing CPI, inflation indices, or market conditions. The Client shall have no right to dispute or negotiate the escalation amount. [RED FLAG: No market benchmark or cap. Over 2 years this increases monthly cost from RM 50,000 to RM 58,320.]</w:t>
-      </w:r>
-    </w:p>
-    <w:p>
-      <w:pPr>
-        <w:pStyle w:val="Heading2"/>
-      </w:pPr>
-      <w:r>
-        <w:rPr>
-          <w:color w:val="1E3A5F"/>
-        </w:rPr>
-        <w:t>6. LIABILITY AND INDEMNIFICATION</w:t>
-      </w:r>
-    </w:p>
-    <w:p>
-      <w:r>
-        <w:rPr>
-          <w:b w:val="0"/>
-          <w:i w:val="0"/>
-          <w:sz w:val="22"/>
-        </w:rPr>
-        <w:t>6.1  Each Party shall indemnify the other against direct losses caused by its own negligence or wilful default.</w:t>
-      </w:r>
-    </w:p>
-    <w:p>
-      <w:r>
-        <w:rPr>
-          <w:b/>
-          <w:i w:val="0"/>
-          <w:sz w:val="22"/>
-        </w:rPr>
-        <w:t>⚠️  6.2  Notwithstanding any other provision of this Agreement, the total aggregate liability of the Service Provider to the Client under or in connection with this Agreement, whether arising in contract, tort, negligence, or otherwise, shall not exceed one (1) month's service fee (RM 50,000). [RED FLAG: Liability cap of RM 50,000 is extremely low. A single infection control breach causing patient harm could result in claims far exceeding this amount.]</w:t>
-      </w:r>
-    </w:p>
-    <w:p>
-      <w:r>
-        <w:rPr>
-          <w:b w:val="0"/>
-          <w:i w:val="0"/>
-          <w:sz w:val="22"/>
-        </w:rPr>
-        <w:t>6.3  Neither Party shall be liable for indirect, consequential, special, or punitive damages.</w:t>
-      </w:r>
-    </w:p>
-    <w:p>
-      <w:pPr>
-        <w:pStyle w:val="Heading2"/>
-      </w:pPr>
-      <w:r>
-        <w:rPr>
-          <w:color w:val="1E3A5F"/>
-        </w:rPr>
-        <w:t>7. TERMINATION AND RENEWAL</w:t>
-      </w:r>
-    </w:p>
-    <w:p>
-      <w:r>
-        <w:rPr>
-          <w:b/>
-          <w:i w:val="0"/>
-          <w:sz w:val="22"/>
-        </w:rPr>
-        <w:t>⚠️  7.1  AUTO-RENEWAL: This Agreement shall automatically renew for a further period of twenty-four (24) months upon expiry of each term, unless either Party provides written notice of non-renewal at least six (6) months prior to the expiry date. [RED FLAG: 6-month notice window is very short. Missing this window locks the Client in for another 2 years automatically.]</w:t>
-      </w:r>
-    </w:p>
-    <w:p>
-      <w:r>
-        <w:rPr>
-          <w:b/>
-          <w:i w:val="0"/>
-          <w:sz w:val="22"/>
-        </w:rPr>
-        <w:t>⚠️  7.2  ASYMMETRIC TERMINATION: The Client may terminate this Agreement for convenience by providing ninety (90) calendar days' written notice to the Service Provider. The Service Provider may terminate this Agreement by providing thirty (30) calendar days' written notice. [RED FLAG: Termination rights are asymmetric — the Service Provider can exit in 30 days while the Client requires 90 days.]</w:t>
-      </w:r>
-    </w:p>
-    <w:p>
-      <w:r>
-        <w:rPr>
-          <w:b w:val="0"/>
-          <w:i w:val="0"/>
-          <w:sz w:val="22"/>
-        </w:rPr>
-        <w:t>7.3  Either Party may terminate immediately upon written notice if the other Party commits a material breach that remains unremedied for thirty (30) calendar days after notice.</w:t>
-      </w:r>
-    </w:p>
-    <w:p>
-      <w:pPr>
-        <w:pStyle w:val="Heading2"/>
-      </w:pPr>
-      <w:r>
-        <w:rPr>
-          <w:color w:val="1E3A5F"/>
-        </w:rPr>
-        <w:t>8. FORCE MAJEURE</w:t>
-      </w:r>
-    </w:p>
-    <w:p>
-      <w:r>
-        <w:rPr>
-          <w:b w:val="0"/>
-          <w:i w:val="0"/>
-          <w:sz w:val="22"/>
-        </w:rPr>
-        <w:t>8.1  Neither Party shall be liable for any failure or delay in performance under this Agreement to the extent caused by circumstances beyond its reasonable control, including acts of God, pandemics, floods, fires, government actions, or industrial disputes, provided that the affected Party gives prompt written notice and uses reasonable endeavours to mitigate the impact.</w:t>
-      </w:r>
-    </w:p>
-    <w:p>
-      <w:pPr>
-        <w:pStyle w:val="Heading2"/>
-      </w:pPr>
-      <w:r>
-        <w:rPr>
-          <w:color w:val="1E3A5F"/>
-        </w:rPr>
-        <w:t>9. CONFIDENTIALITY</w:t>
-      </w:r>
-    </w:p>
-    <w:p>
-      <w:r>
-        <w:rPr>
-          <w:b w:val="0"/>
-          <w:i w:val="0"/>
-          <w:sz w:val="22"/>
-        </w:rPr>
-        <w:t>9.1  Each Party shall keep confidential all Confidential Information received from the other Party and shall not disclose such information to any third party without prior written consent, except as required by law or regulatory authority.</w:t>
-      </w:r>
-    </w:p>
-    <w:p>
-      <w:pPr>
-        <w:pStyle w:val="Heading2"/>
-      </w:pPr>
-      <w:r>
-        <w:rPr>
-          <w:color w:val="1E3A5F"/>
-        </w:rPr>
-        <w:t>10. DISPUTE RESOLUTION</w:t>
-      </w:r>
-    </w:p>
-    <w:p>
-      <w:r>
-        <w:rPr>
-          <w:b w:val="0"/>
-          <w:i w:val="0"/>
-          <w:sz w:val="22"/>
-        </w:rPr>
-        <w:t>10.1  The Parties shall attempt to resolve any dispute arising under this Agreement through good-faith negotiation within thirty (30) calendar days of written notification of the dispute.</w:t>
-      </w:r>
-    </w:p>
-    <w:p>
-      <w:r>
-        <w:rPr>
-          <w:b w:val="0"/>
-          <w:i w:val="0"/>
-          <w:sz w:val="22"/>
-        </w:rPr>
-        <w:t>10.2  If the dispute cannot be resolved through negotiation, it shall be referred to binding arbitration administered by the Asian International Arbitration Centre (AIAC) in Kuala Lumpur, Malaysia, in accordance with the AIAC Arbitration Rules. The arbitration shall be conducted in the English language.</w:t>
-      </w:r>
-    </w:p>
-    <w:p>
-      <w:pPr>
-        <w:pStyle w:val="Heading2"/>
-      </w:pPr>
-      <w:r>
-        <w:rPr>
-          <w:color w:val="1E3A5F"/>
-        </w:rPr>
-        <w:t>11. GOVERNING LAW</w:t>
-      </w:r>
-    </w:p>
-    <w:p>
-      <w:r>
-        <w:rPr>
-          <w:b w:val="0"/>
-          <w:i w:val="0"/>
-          <w:sz w:val="22"/>
-        </w:rPr>
-        <w:t>11.1  This Agreement shall be governed by and construed in accordance with the laws of Malaysia.</w:t>
-      </w:r>
-    </w:p>
-    <w:p/>
-    <w:p>
-      <w:r>
-        <w:rPr>
-          <w:b w:val="0"/>
-          <w:i/>
-          <w:sz w:val="22"/>
-        </w:rPr>
-        <w:t>IN WITNESS WHEREOF, the Parties have executed this Agreement as of the date last written below.</w:t>
+        <w:t>IN WITNESS WHEREOF, the parties have executed this Agreement as of the Effective Date.</w:t>
       </w:r>
     </w:p>
     <w:p/>
     <w:tbl>
       <w:tblPr>
+        <w:tblStyle w:val="TableGrid"/>
         <w:tblW w:type="auto" w:w="0"/>
         <w:tblLook w:firstColumn="1" w:firstRow="1" w:lastColumn="0" w:lastRow="0" w:noHBand="0" w:noVBand="1" w:val="04A0"/>
       </w:tblPr>
@@ -806,7 +1660,9 @@
               <w:rPr>
                 <w:b/>
               </w:rPr>
-              <w:t>For and on behalf of CLIENT:</w:t>
+              <w:t>FOR AND ON BEHALF OF</w:t>
+              <w:br/>
+              <w:t>CONTOSO MEDICAL GROUP SDN BHD</w:t>
             </w:r>
           </w:p>
         </w:tc>
@@ -819,7 +1675,9 @@
               <w:rPr>
                 <w:b/>
               </w:rPr>
-              <w:t>For and on behalf of SERVICE PROVIDER:</w:t>
+              <w:t>FOR AND ON BEHALF OF</w:t>
+              <w:br/>
+              <w:t>TECHMED SERVICES SDN BHD</w:t>
             </w:r>
           </w:p>
         </w:tc>
@@ -831,7 +1689,7 @@
           </w:tcPr>
           <w:p>
             <w:r>
-              <w:t>Contoso Medical Centre Sdn Bhd</w:t>
+              <w:t>Authorised Signatory:</w:t>
             </w:r>
           </w:p>
         </w:tc>
@@ -841,7 +1699,7 @@
           </w:tcPr>
           <w:p>
             <w:r>
-              <w:t>CleanMed Services Sdn Bhd</w:t>
+              <w:t>Authorised Signatory:</w:t>
             </w:r>
           </w:p>
         </w:tc>
@@ -853,7 +1711,7 @@
           </w:tcPr>
           <w:p>
             <w:r>
-              <w:t>Signature: ___________________________</w:t>
+              <w:t>Name:</w:t>
             </w:r>
           </w:p>
         </w:tc>
@@ -863,7 +1721,7 @@
           </w:tcPr>
           <w:p>
             <w:r>
-              <w:t>Signature: ___________________________</w:t>
+              <w:t>Name:</w:t>
             </w:r>
           </w:p>
         </w:tc>
@@ -875,7 +1733,7 @@
           </w:tcPr>
           <w:p>
             <w:r>
-              <w:t>Name: Dr. James Lim  |  Designation: Chief Financial Officer</w:t>
+              <w:t>Designation:</w:t>
             </w:r>
           </w:p>
         </w:tc>
@@ -885,7 +1743,7 @@
           </w:tcPr>
           <w:p>
             <w:r>
-              <w:t>Name: Mr. Rajan Krishnamurthy  |  Designation: Managing Director</w:t>
+              <w:t>Designation:</w:t>
             </w:r>
           </w:p>
         </w:tc>
@@ -897,7 +1755,7 @@
           </w:tcPr>
           <w:p>
             <w:r>
-              <w:t>Date: _______________________________</w:t>
+              <w:t>Date:</w:t>
             </w:r>
           </w:p>
         </w:tc>
@@ -907,7 +1765,7 @@
           </w:tcPr>
           <w:p>
             <w:r>
-              <w:t>Date: _______________________________</w:t>
+              <w:t>Date:</w:t>
             </w:r>
           </w:p>
         </w:tc>
@@ -1286,10 +2144,6 @@
     <w:name w:val="Normal"/>
     <w:qFormat/>
     <w:rsid w:val="00FC693F"/>
-    <w:rPr>
-      <w:rFonts w:ascii="Calibri" w:hAnsi="Calibri"/>
-      <w:sz w:val="22"/>
-    </w:rPr>
   </w:style>
   <w:style w:type="paragraph" w:styleId="Header">
     <w:name w:val="header"/>

</xml_diff>